<commit_message>
Relecture finale de l'offre v2 et mail d'envoi
- Élision « d'E-VOLUTION XP », reformulation de l'hypothèse sur les
  pénalités, ajout des sigles OD et IFRS au glossaire
- Texte du mail d'envoi de l'offre v2

Co-Authored-By: Claude Fable 5.1 <noreply@anthropic.com>
Claude-Session: https://claude.ai/code/session_0179U1EgeN6zS3U2LunpEbFp
</commit_message>
<xml_diff>
--- a/docs/offre/Offre_technique_financiere_EGUITRA_v2.docx
+++ b/docs/offre/Offre_technique_financiere_EGUITRA_v2.docx
@@ -1362,7 +1362,7 @@
           <w:sz w:val="22"/>
           <w:szCs w:val="22"/>
         </w:rPr>
-        <w:t xml:space="preserve">Les applications métier sont développées sur mesure et constituent la seule interface utilisée par vos équipes : EGUITRA Finance pour le groupe, AxisPro Suite pour le cabinet. Elles reprennent votre identité visuelle, votre vocabulaire et vos parcours de saisie. Le client web du noyau n'est jamais exposé aux utilisateurs ; il reste accessible à la seule équipe technique de E-VOLUTION XP, sur un accès réseau restreint. Cette approche est celle que nous avons mise en œuvre pour SOGUIPREM.</w:t>
+        <w:t xml:space="preserve">Les applications métier sont développées sur mesure et constituent la seule interface utilisée par vos équipes : EGUITRA Finance pour le groupe, AxisPro Suite pour le cabinet. Elles reprennent votre identité visuelle, votre vocabulaire et vos parcours de saisie. Le client web du noyau n'est jamais exposé aux utilisateurs ; il reste accessible à la seule équipe technique d'E-VOLUTION XP, sur un accès réseau restreint. Cette approche est celle que nous avons mise en œuvre pour SOGUIPREM.</w:t>
       </w:r>
     </w:p>
     <w:p>
@@ -8765,7 +8765,7 @@
           <w:sz w:val="22"/>
           <w:szCs w:val="22"/>
         </w:rPr>
-        <w:t xml:space="preserve">La garantie corrective de 6 mois et les pénalités de retard sont comprises dans le montant.</w:t>
+        <w:t xml:space="preserve">La garantie corrective de 6 mois est comprise dans le montant. L'engagement de délai et les pénalités de retard qui l'accompagnent n'entraînent aucun surcoût.</w:t>
       </w:r>
     </w:p>
     <w:p>
@@ -12417,6 +12417,144 @@
                 <w:szCs w:val="19"/>
               </w:rPr>
               <w:t xml:space="preserve">Ratio de couverture du service de la dette.</w:t>
+            </w:r>
+          </w:p>
+        </w:tc>
+      </w:tr>
+      <w:tr>
+        <w:tc>
+          <w:tcPr>
+            <w:tcW w:type="dxa" w:w="2000"/>
+            <w:tcBorders>
+              <w:top w:val="single" w:color="C9CFD8" w:sz="4"/>
+              <w:left w:val="single" w:color="C9CFD8" w:sz="4"/>
+              <w:bottom w:val="single" w:color="C9CFD8" w:sz="4"/>
+              <w:right w:val="single" w:color="C9CFD8" w:sz="4"/>
+            </w:tcBorders>
+            <w:shd w:fill="F2F4F7" w:color="auto" w:val="clear"/>
+            <w:tcMar>
+              <w:top w:type="dxa" w:w="60"/>
+              <w:left w:type="dxa" w:w="100"/>
+              <w:bottom w:type="dxa" w:w="60"/>
+              <w:right w:type="dxa" w:w="100"/>
+            </w:tcMar>
+            <w:vAlign w:val="center"/>
+          </w:tcPr>
+          <w:p>
+            <w:pPr>
+              <w:spacing w:after="0"/>
+            </w:pPr>
+            <w:r>
+              <w:rPr>
+                <w:rFonts w:ascii="Calibri" w:cs="Calibri" w:eastAsia="Calibri" w:hAnsi="Calibri"/>
+                <w:b w:val="false"/>
+                <w:bCs w:val="false"/>
+                <w:sz w:val="19"/>
+                <w:szCs w:val="19"/>
+              </w:rPr>
+              <w:t xml:space="preserve">OD</w:t>
+            </w:r>
+          </w:p>
+        </w:tc>
+        <w:tc>
+          <w:tcPr>
+            <w:tcW w:type="dxa" w:w="7638"/>
+            <w:tcBorders>
+              <w:top w:val="single" w:color="C9CFD8" w:sz="4"/>
+              <w:left w:val="single" w:color="C9CFD8" w:sz="4"/>
+              <w:bottom w:val="single" w:color="C9CFD8" w:sz="4"/>
+              <w:right w:val="single" w:color="C9CFD8" w:sz="4"/>
+            </w:tcBorders>
+            <w:shd w:fill="F2F4F7" w:color="auto" w:val="clear"/>
+            <w:tcMar>
+              <w:top w:type="dxa" w:w="60"/>
+              <w:left w:type="dxa" w:w="100"/>
+              <w:bottom w:type="dxa" w:w="60"/>
+              <w:right w:type="dxa" w:w="100"/>
+            </w:tcMar>
+            <w:vAlign w:val="center"/>
+          </w:tcPr>
+          <w:p>
+            <w:pPr>
+              <w:spacing w:after="0"/>
+            </w:pPr>
+            <w:r>
+              <w:rPr>
+                <w:rFonts w:ascii="Calibri" w:cs="Calibri" w:eastAsia="Calibri" w:hAnsi="Calibri"/>
+                <w:b w:val="false"/>
+                <w:bCs w:val="false"/>
+                <w:sz w:val="19"/>
+                <w:szCs w:val="19"/>
+              </w:rPr>
+              <w:t xml:space="preserve">Opérations diverses : écritures comptables qui ne relèvent ni des ventes, ni des achats, ni de la trésorerie.</w:t>
+            </w:r>
+          </w:p>
+        </w:tc>
+      </w:tr>
+      <w:tr>
+        <w:tc>
+          <w:tcPr>
+            <w:tcW w:type="dxa" w:w="2000"/>
+            <w:tcBorders>
+              <w:top w:val="single" w:color="C9CFD8" w:sz="4"/>
+              <w:left w:val="single" w:color="C9CFD8" w:sz="4"/>
+              <w:bottom w:val="single" w:color="C9CFD8" w:sz="4"/>
+              <w:right w:val="single" w:color="C9CFD8" w:sz="4"/>
+            </w:tcBorders>
+            <w:tcMar>
+              <w:top w:type="dxa" w:w="60"/>
+              <w:left w:type="dxa" w:w="100"/>
+              <w:bottom w:type="dxa" w:w="60"/>
+              <w:right w:type="dxa" w:w="100"/>
+            </w:tcMar>
+            <w:vAlign w:val="center"/>
+          </w:tcPr>
+          <w:p>
+            <w:pPr>
+              <w:spacing w:after="0"/>
+            </w:pPr>
+            <w:r>
+              <w:rPr>
+                <w:rFonts w:ascii="Calibri" w:cs="Calibri" w:eastAsia="Calibri" w:hAnsi="Calibri"/>
+                <w:b w:val="false"/>
+                <w:bCs w:val="false"/>
+                <w:sz w:val="19"/>
+                <w:szCs w:val="19"/>
+              </w:rPr>
+              <w:t xml:space="preserve">IFRS</w:t>
+            </w:r>
+          </w:p>
+        </w:tc>
+        <w:tc>
+          <w:tcPr>
+            <w:tcW w:type="dxa" w:w="7638"/>
+            <w:tcBorders>
+              <w:top w:val="single" w:color="C9CFD8" w:sz="4"/>
+              <w:left w:val="single" w:color="C9CFD8" w:sz="4"/>
+              <w:bottom w:val="single" w:color="C9CFD8" w:sz="4"/>
+              <w:right w:val="single" w:color="C9CFD8" w:sz="4"/>
+            </w:tcBorders>
+            <w:tcMar>
+              <w:top w:type="dxa" w:w="60"/>
+              <w:left w:type="dxa" w:w="100"/>
+              <w:bottom w:type="dxa" w:w="60"/>
+              <w:right w:type="dxa" w:w="100"/>
+            </w:tcMar>
+            <w:vAlign w:val="center"/>
+          </w:tcPr>
+          <w:p>
+            <w:pPr>
+              <w:spacing w:after="0"/>
+            </w:pPr>
+            <w:r>
+              <w:rPr>
+                <w:rFonts w:ascii="Calibri" w:cs="Calibri" w:eastAsia="Calibri" w:hAnsi="Calibri"/>
+                <w:b w:val="false"/>
+                <w:bCs w:val="false"/>
+                <w:sz w:val="19"/>
+                <w:szCs w:val="19"/>
+              </w:rPr>
+              <w:t xml:space="preserve">Normes internationales d'information financière, utilisées par les banques et investisseurs étrangers.</w:t>
             </w:r>
           </w:p>
         </w:tc>

</xml_diff>

<commit_message>
Annexe : ventilation recentrée sur les postes techniques
Treize postes au lieu de huit : serveur, nom de domaine offert, paramétrage
du noyau et un poste par module développé. 90 % du montant sur la technique.
La même ventilation est reportée dans l'offre v2 (chapitre 7.2) pour rester
cohérente ; un montant nul s'affiche « Offert ».

Co-Authored-By: Claude Fable 5.1 <noreply@anthropic.com>
Claude-Session: https://claude.ai/code/session_0179U1EgeN6zS3U2LunpEbFp
</commit_message>
<xml_diff>
--- a/docs/offre/Offre_technique_financiere_EGUITRA_v2.docx
+++ b/docs/offre/Offre_technique_financiere_EGUITRA_v2.docx
@@ -8975,7 +8975,7 @@
                 <w:sz w:val="19"/>
                 <w:szCs w:val="19"/>
               </w:rPr>
-              <w:t xml:space="preserve">3 000 000 GNF</w:t>
+              <w:t xml:space="preserve">1 500 000 GNF</w:t>
             </w:r>
           </w:p>
         </w:tc>
@@ -9008,7 +9008,7 @@
                 <w:sz w:val="19"/>
                 <w:szCs w:val="19"/>
               </w:rPr>
-              <w:t xml:space="preserve">6 %</w:t>
+              <w:t xml:space="preserve">3 %</w:t>
             </w:r>
           </w:p>
         </w:tc>
@@ -9044,7 +9044,7 @@
                 <w:sz w:val="19"/>
                 <w:szCs w:val="19"/>
               </w:rPr>
-              <w:t xml:space="preserve">Socle technique : VPS, installation du noyau et des modules communautaires, sécurité, sauvegardes, supervision</w:t>
+              <w:t xml:space="preserve">Serveur VPS : acquisition et configuration complète (système, conteneurs, proxy TLS, base de données, supervision, sauvegardes renforcées)</w:t>
             </w:r>
           </w:p>
         </w:tc>
@@ -9078,7 +9078,7 @@
                 <w:sz w:val="19"/>
                 <w:szCs w:val="19"/>
               </w:rPr>
-              <w:t xml:space="preserve">4 000 000 GNF</w:t>
+              <w:t xml:space="preserve">5 000 000 GNF</w:t>
             </w:r>
           </w:p>
         </w:tc>
@@ -9112,7 +9112,7 @@
                 <w:sz w:val="19"/>
                 <w:szCs w:val="19"/>
               </w:rPr>
-              <w:t xml:space="preserve">8 %</w:t>
+              <w:t xml:space="preserve">10 %</w:t>
             </w:r>
           </w:p>
         </w:tc>
@@ -9147,7 +9147,7 @@
                 <w:sz w:val="19"/>
                 <w:szCs w:val="19"/>
               </w:rPr>
-              <w:t xml:space="preserve">EGUITRA Finance : paramétrage SYSCOHADA, analytique, trésorerie et rapprochement, immobilisations, budget, approbations, états financiers, 18 écrans</w:t>
+              <w:t xml:space="preserve">Nom de domaine et certificats TLS</w:t>
             </w:r>
           </w:p>
         </w:tc>
@@ -9180,7 +9180,7 @@
                 <w:sz w:val="19"/>
                 <w:szCs w:val="19"/>
               </w:rPr>
-              <w:t xml:space="preserve">17 000 000 GNF</w:t>
+              <w:t xml:space="preserve">Offert</w:t>
             </w:r>
           </w:p>
         </w:tc>
@@ -9213,7 +9213,7 @@
                 <w:sz w:val="19"/>
                 <w:szCs w:val="19"/>
               </w:rPr>
-              <w:t xml:space="preserve">34 %</w:t>
+              <w:t xml:space="preserve">0 %</w:t>
             </w:r>
           </w:p>
         </w:tc>
@@ -9249,7 +9249,7 @@
                 <w:sz w:val="19"/>
                 <w:szCs w:val="19"/>
               </w:rPr>
-              <w:t xml:space="preserve">Transport pétrolier et BTP : rotations, flotte, rentabilité par camion et par route, application mobile, chantiers, retenues de garantie</w:t>
+              <w:t xml:space="preserve">Installation et paramétrage du noyau et des modules communautaires : plan SYSCOHADA, sociétés, devises, journaux, axes analytiques</w:t>
             </w:r>
           </w:p>
         </w:tc>
@@ -9283,7 +9283,7 @@
                 <w:sz w:val="19"/>
                 <w:szCs w:val="19"/>
               </w:rPr>
-              <w:t xml:space="preserve">8 000 000 GNF</w:t>
+              <w:t xml:space="preserve">5 000 000 GNF</w:t>
             </w:r>
           </w:p>
         </w:tc>
@@ -9317,7 +9317,7 @@
                 <w:sz w:val="19"/>
                 <w:szCs w:val="19"/>
               </w:rPr>
-              <w:t xml:space="preserve">16 %</w:t>
+              <w:t xml:space="preserve">10 %</w:t>
             </w:r>
           </w:p>
         </w:tc>
@@ -9352,7 +9352,7 @@
                 <w:sz w:val="19"/>
                 <w:szCs w:val="19"/>
               </w:rPr>
-              <w:t xml:space="preserve">Immobilier, fiscalité guinéenne, consolidation groupe, passerelle IFRS</w:t>
+              <w:t xml:space="preserve">Module EGUITRA Finance : API métier, règles de gestion, contrôles de clôture, alertes, états financiers, 18 écrans</w:t>
             </w:r>
           </w:p>
         </w:tc>
@@ -9385,7 +9385,7 @@
                 <w:sz w:val="19"/>
                 <w:szCs w:val="19"/>
               </w:rPr>
-              <w:t xml:space="preserve">4 000 000 GNF</w:t>
+              <w:t xml:space="preserve">14 000 000 GNF</w:t>
             </w:r>
           </w:p>
         </w:tc>
@@ -9418,7 +9418,7 @@
                 <w:sz w:val="19"/>
                 <w:szCs w:val="19"/>
               </w:rPr>
-              <w:t xml:space="preserve">8 %</w:t>
+              <w:t xml:space="preserve">28 %</w:t>
             </w:r>
           </w:p>
         </w:tc>
@@ -9454,7 +9454,7 @@
                 <w:sz w:val="19"/>
                 <w:szCs w:val="19"/>
               </w:rPr>
-              <w:t xml:space="preserve">AxisPro Suite : grille de critères, stage gates, scoring, data room, revues de comité, rapports, portail des porteurs</w:t>
+              <w:t xml:space="preserve">Module transport pétrolier : rotations, flotte, routes et tarifs, rentabilité par camion et par route, application mobile</w:t>
             </w:r>
           </w:p>
         </w:tc>
@@ -9488,7 +9488,7 @@
                 <w:sz w:val="19"/>
                 <w:szCs w:val="19"/>
               </w:rPr>
-              <w:t xml:space="preserve">8 000 000 GNF</w:t>
+              <w:t xml:space="preserve">6 000 000 GNF</w:t>
             </w:r>
           </w:p>
         </w:tc>
@@ -9522,7 +9522,7 @@
                 <w:sz w:val="19"/>
                 <w:szCs w:val="19"/>
               </w:rPr>
-              <w:t xml:space="preserve">16 %</w:t>
+              <w:t xml:space="preserve">12 %</w:t>
             </w:r>
           </w:p>
         </w:tc>
@@ -9557,7 +9557,7 @@
                 <w:sz w:val="19"/>
                 <w:szCs w:val="19"/>
               </w:rPr>
-              <w:t xml:space="preserve">Reprise des données de l'exercice en cours, recette, formation, mise en production</w:t>
+              <w:t xml:space="preserve">Module BTP : chantiers, situations d'avancement, retenues de garantie</w:t>
             </w:r>
           </w:p>
         </w:tc>
@@ -9659,7 +9659,7 @@
                 <w:sz w:val="19"/>
                 <w:szCs w:val="19"/>
               </w:rPr>
-              <w:t xml:space="preserve">Hébergement VPS, nom de domaine et sauvegardes hors site pendant 12 mois</w:t>
+              <w:t xml:space="preserve">Module immobilier : biens, baux, quittancement, patrimoine</w:t>
             </w:r>
           </w:p>
         </w:tc>
@@ -9693,7 +9693,7 @@
                 <w:sz w:val="19"/>
                 <w:szCs w:val="19"/>
               </w:rPr>
-              <w:t xml:space="preserve">3 000 000 GNF</w:t>
+              <w:t xml:space="preserve">2 500 000 GNF</w:t>
             </w:r>
           </w:p>
         </w:tc>
@@ -9727,7 +9727,518 @@
                 <w:sz w:val="19"/>
                 <w:szCs w:val="19"/>
               </w:rPr>
-              <w:t xml:space="preserve">6 %</w:t>
+              <w:t xml:space="preserve">5 %</w:t>
+            </w:r>
+          </w:p>
+        </w:tc>
+      </w:tr>
+      <w:tr>
+        <w:tc>
+          <w:tcPr>
+            <w:tcW w:type="dxa" w:w="6238"/>
+            <w:tcBorders>
+              <w:top w:val="single" w:color="C9CFD8" w:sz="4"/>
+              <w:left w:val="single" w:color="C9CFD8" w:sz="4"/>
+              <w:bottom w:val="single" w:color="C9CFD8" w:sz="4"/>
+              <w:right w:val="single" w:color="C9CFD8" w:sz="4"/>
+            </w:tcBorders>
+            <w:tcMar>
+              <w:top w:type="dxa" w:w="60"/>
+              <w:left w:type="dxa" w:w="100"/>
+              <w:bottom w:type="dxa" w:w="60"/>
+              <w:right w:type="dxa" w:w="100"/>
+            </w:tcMar>
+            <w:vAlign w:val="center"/>
+          </w:tcPr>
+          <w:p>
+            <w:pPr>
+              <w:spacing w:after="0"/>
+            </w:pPr>
+            <w:r>
+              <w:rPr>
+                <w:rFonts w:ascii="Calibri" w:cs="Calibri" w:eastAsia="Calibri" w:hAnsi="Calibri"/>
+                <w:b w:val="false"/>
+                <w:bCs w:val="false"/>
+                <w:sz w:val="19"/>
+                <w:szCs w:val="19"/>
+              </w:rPr>
+              <w:t xml:space="preserve">Module fiscalité guinéenne, consolidation groupe et passerelle IFRS</w:t>
+            </w:r>
+          </w:p>
+        </w:tc>
+        <w:tc>
+          <w:tcPr>
+            <w:tcW w:type="dxa" w:w="2200"/>
+            <w:tcBorders>
+              <w:top w:val="single" w:color="C9CFD8" w:sz="4"/>
+              <w:left w:val="single" w:color="C9CFD8" w:sz="4"/>
+              <w:bottom w:val="single" w:color="C9CFD8" w:sz="4"/>
+              <w:right w:val="single" w:color="C9CFD8" w:sz="4"/>
+            </w:tcBorders>
+            <w:tcMar>
+              <w:top w:type="dxa" w:w="60"/>
+              <w:left w:type="dxa" w:w="100"/>
+              <w:bottom w:type="dxa" w:w="60"/>
+              <w:right w:type="dxa" w:w="100"/>
+            </w:tcMar>
+            <w:vAlign w:val="center"/>
+          </w:tcPr>
+          <w:p>
+            <w:pPr>
+              <w:spacing w:after="0"/>
+            </w:pPr>
+            <w:r>
+              <w:rPr>
+                <w:rFonts w:ascii="Calibri" w:cs="Calibri" w:eastAsia="Calibri" w:hAnsi="Calibri"/>
+                <w:b w:val="false"/>
+                <w:bCs w:val="false"/>
+                <w:sz w:val="19"/>
+                <w:szCs w:val="19"/>
+              </w:rPr>
+              <w:t xml:space="preserve">2 500 000 GNF</w:t>
+            </w:r>
+          </w:p>
+        </w:tc>
+        <w:tc>
+          <w:tcPr>
+            <w:tcW w:type="dxa" w:w="1200"/>
+            <w:tcBorders>
+              <w:top w:val="single" w:color="C9CFD8" w:sz="4"/>
+              <w:left w:val="single" w:color="C9CFD8" w:sz="4"/>
+              <w:bottom w:val="single" w:color="C9CFD8" w:sz="4"/>
+              <w:right w:val="single" w:color="C9CFD8" w:sz="4"/>
+            </w:tcBorders>
+            <w:tcMar>
+              <w:top w:type="dxa" w:w="60"/>
+              <w:left w:type="dxa" w:w="100"/>
+              <w:bottom w:type="dxa" w:w="60"/>
+              <w:right w:type="dxa" w:w="100"/>
+            </w:tcMar>
+            <w:vAlign w:val="center"/>
+          </w:tcPr>
+          <w:p>
+            <w:pPr>
+              <w:spacing w:after="0"/>
+            </w:pPr>
+            <w:r>
+              <w:rPr>
+                <w:rFonts w:ascii="Calibri" w:cs="Calibri" w:eastAsia="Calibri" w:hAnsi="Calibri"/>
+                <w:b w:val="false"/>
+                <w:bCs w:val="false"/>
+                <w:sz w:val="19"/>
+                <w:szCs w:val="19"/>
+              </w:rPr>
+              <w:t xml:space="preserve">5 %</w:t>
+            </w:r>
+          </w:p>
+        </w:tc>
+      </w:tr>
+      <w:tr>
+        <w:tc>
+          <w:tcPr>
+            <w:tcW w:type="dxa" w:w="6238"/>
+            <w:tcBorders>
+              <w:top w:val="single" w:color="C9CFD8" w:sz="4"/>
+              <w:left w:val="single" w:color="C9CFD8" w:sz="4"/>
+              <w:bottom w:val="single" w:color="C9CFD8" w:sz="4"/>
+              <w:right w:val="single" w:color="C9CFD8" w:sz="4"/>
+            </w:tcBorders>
+            <w:shd w:fill="F2F4F7" w:color="auto" w:val="clear"/>
+            <w:tcMar>
+              <w:top w:type="dxa" w:w="60"/>
+              <w:left w:type="dxa" w:w="100"/>
+              <w:bottom w:type="dxa" w:w="60"/>
+              <w:right w:type="dxa" w:w="100"/>
+            </w:tcMar>
+            <w:vAlign w:val="center"/>
+          </w:tcPr>
+          <w:p>
+            <w:pPr>
+              <w:spacing w:after="0"/>
+            </w:pPr>
+            <w:r>
+              <w:rPr>
+                <w:rFonts w:ascii="Calibri" w:cs="Calibri" w:eastAsia="Calibri" w:hAnsi="Calibri"/>
+                <w:b w:val="false"/>
+                <w:bCs w:val="false"/>
+                <w:sz w:val="19"/>
+                <w:szCs w:val="19"/>
+              </w:rPr>
+              <w:t xml:space="preserve">Module AxisPro Suite : grille de critères, stage gates, scoring, data room, revues de comité, rapports, portail des porteurs</w:t>
+            </w:r>
+          </w:p>
+        </w:tc>
+        <w:tc>
+          <w:tcPr>
+            <w:tcW w:type="dxa" w:w="2200"/>
+            <w:tcBorders>
+              <w:top w:val="single" w:color="C9CFD8" w:sz="4"/>
+              <w:left w:val="single" w:color="C9CFD8" w:sz="4"/>
+              <w:bottom w:val="single" w:color="C9CFD8" w:sz="4"/>
+              <w:right w:val="single" w:color="C9CFD8" w:sz="4"/>
+            </w:tcBorders>
+            <w:shd w:fill="F2F4F7" w:color="auto" w:val="clear"/>
+            <w:tcMar>
+              <w:top w:type="dxa" w:w="60"/>
+              <w:left w:type="dxa" w:w="100"/>
+              <w:bottom w:type="dxa" w:w="60"/>
+              <w:right w:type="dxa" w:w="100"/>
+            </w:tcMar>
+            <w:vAlign w:val="center"/>
+          </w:tcPr>
+          <w:p>
+            <w:pPr>
+              <w:spacing w:after="0"/>
+            </w:pPr>
+            <w:r>
+              <w:rPr>
+                <w:rFonts w:ascii="Calibri" w:cs="Calibri" w:eastAsia="Calibri" w:hAnsi="Calibri"/>
+                <w:b w:val="false"/>
+                <w:bCs w:val="false"/>
+                <w:sz w:val="19"/>
+                <w:szCs w:val="19"/>
+              </w:rPr>
+              <w:t xml:space="preserve">7 000 000 GNF</w:t>
+            </w:r>
+          </w:p>
+        </w:tc>
+        <w:tc>
+          <w:tcPr>
+            <w:tcW w:type="dxa" w:w="1200"/>
+            <w:tcBorders>
+              <w:top w:val="single" w:color="C9CFD8" w:sz="4"/>
+              <w:left w:val="single" w:color="C9CFD8" w:sz="4"/>
+              <w:bottom w:val="single" w:color="C9CFD8" w:sz="4"/>
+              <w:right w:val="single" w:color="C9CFD8" w:sz="4"/>
+            </w:tcBorders>
+            <w:shd w:fill="F2F4F7" w:color="auto" w:val="clear"/>
+            <w:tcMar>
+              <w:top w:type="dxa" w:w="60"/>
+              <w:left w:type="dxa" w:w="100"/>
+              <w:bottom w:type="dxa" w:w="60"/>
+              <w:right w:type="dxa" w:w="100"/>
+            </w:tcMar>
+            <w:vAlign w:val="center"/>
+          </w:tcPr>
+          <w:p>
+            <w:pPr>
+              <w:spacing w:after="0"/>
+            </w:pPr>
+            <w:r>
+              <w:rPr>
+                <w:rFonts w:ascii="Calibri" w:cs="Calibri" w:eastAsia="Calibri" w:hAnsi="Calibri"/>
+                <w:b w:val="false"/>
+                <w:bCs w:val="false"/>
+                <w:sz w:val="19"/>
+                <w:szCs w:val="19"/>
+              </w:rPr>
+              <w:t xml:space="preserve">14 %</w:t>
+            </w:r>
+          </w:p>
+        </w:tc>
+      </w:tr>
+      <w:tr>
+        <w:tc>
+          <w:tcPr>
+            <w:tcW w:type="dxa" w:w="6238"/>
+            <w:tcBorders>
+              <w:top w:val="single" w:color="C9CFD8" w:sz="4"/>
+              <w:left w:val="single" w:color="C9CFD8" w:sz="4"/>
+              <w:bottom w:val="single" w:color="C9CFD8" w:sz="4"/>
+              <w:right w:val="single" w:color="C9CFD8" w:sz="4"/>
+            </w:tcBorders>
+            <w:tcMar>
+              <w:top w:type="dxa" w:w="60"/>
+              <w:left w:type="dxa" w:w="100"/>
+              <w:bottom w:type="dxa" w:w="60"/>
+              <w:right w:type="dxa" w:w="100"/>
+            </w:tcMar>
+            <w:vAlign w:val="center"/>
+          </w:tcPr>
+          <w:p>
+            <w:pPr>
+              <w:spacing w:after="0"/>
+            </w:pPr>
+            <w:r>
+              <w:rPr>
+                <w:rFonts w:ascii="Calibri" w:cs="Calibri" w:eastAsia="Calibri" w:hAnsi="Calibri"/>
+                <w:b w:val="false"/>
+                <w:bCs w:val="false"/>
+                <w:sz w:val="19"/>
+                <w:szCs w:val="19"/>
+              </w:rPr>
+              <w:t xml:space="preserve">Reprise des données de l'exercice en cours</w:t>
+            </w:r>
+          </w:p>
+        </w:tc>
+        <w:tc>
+          <w:tcPr>
+            <w:tcW w:type="dxa" w:w="2200"/>
+            <w:tcBorders>
+              <w:top w:val="single" w:color="C9CFD8" w:sz="4"/>
+              <w:left w:val="single" w:color="C9CFD8" w:sz="4"/>
+              <w:bottom w:val="single" w:color="C9CFD8" w:sz="4"/>
+              <w:right w:val="single" w:color="C9CFD8" w:sz="4"/>
+            </w:tcBorders>
+            <w:tcMar>
+              <w:top w:type="dxa" w:w="60"/>
+              <w:left w:type="dxa" w:w="100"/>
+              <w:bottom w:type="dxa" w:w="60"/>
+              <w:right w:type="dxa" w:w="100"/>
+            </w:tcMar>
+            <w:vAlign w:val="center"/>
+          </w:tcPr>
+          <w:p>
+            <w:pPr>
+              <w:spacing w:after="0"/>
+            </w:pPr>
+            <w:r>
+              <w:rPr>
+                <w:rFonts w:ascii="Calibri" w:cs="Calibri" w:eastAsia="Calibri" w:hAnsi="Calibri"/>
+                <w:b w:val="false"/>
+                <w:bCs w:val="false"/>
+                <w:sz w:val="19"/>
+                <w:szCs w:val="19"/>
+              </w:rPr>
+              <w:t xml:space="preserve">1 000 000 GNF</w:t>
+            </w:r>
+          </w:p>
+        </w:tc>
+        <w:tc>
+          <w:tcPr>
+            <w:tcW w:type="dxa" w:w="1200"/>
+            <w:tcBorders>
+              <w:top w:val="single" w:color="C9CFD8" w:sz="4"/>
+              <w:left w:val="single" w:color="C9CFD8" w:sz="4"/>
+              <w:bottom w:val="single" w:color="C9CFD8" w:sz="4"/>
+              <w:right w:val="single" w:color="C9CFD8" w:sz="4"/>
+            </w:tcBorders>
+            <w:tcMar>
+              <w:top w:type="dxa" w:w="60"/>
+              <w:left w:type="dxa" w:w="100"/>
+              <w:bottom w:type="dxa" w:w="60"/>
+              <w:right w:type="dxa" w:w="100"/>
+            </w:tcMar>
+            <w:vAlign w:val="center"/>
+          </w:tcPr>
+          <w:p>
+            <w:pPr>
+              <w:spacing w:after="0"/>
+            </w:pPr>
+            <w:r>
+              <w:rPr>
+                <w:rFonts w:ascii="Calibri" w:cs="Calibri" w:eastAsia="Calibri" w:hAnsi="Calibri"/>
+                <w:b w:val="false"/>
+                <w:bCs w:val="false"/>
+                <w:sz w:val="19"/>
+                <w:szCs w:val="19"/>
+              </w:rPr>
+              <w:t xml:space="preserve">2 %</w:t>
+            </w:r>
+          </w:p>
+        </w:tc>
+      </w:tr>
+      <w:tr>
+        <w:tc>
+          <w:tcPr>
+            <w:tcW w:type="dxa" w:w="6238"/>
+            <w:tcBorders>
+              <w:top w:val="single" w:color="C9CFD8" w:sz="4"/>
+              <w:left w:val="single" w:color="C9CFD8" w:sz="4"/>
+              <w:bottom w:val="single" w:color="C9CFD8" w:sz="4"/>
+              <w:right w:val="single" w:color="C9CFD8" w:sz="4"/>
+            </w:tcBorders>
+            <w:shd w:fill="F2F4F7" w:color="auto" w:val="clear"/>
+            <w:tcMar>
+              <w:top w:type="dxa" w:w="60"/>
+              <w:left w:type="dxa" w:w="100"/>
+              <w:bottom w:type="dxa" w:w="60"/>
+              <w:right w:type="dxa" w:w="100"/>
+            </w:tcMar>
+            <w:vAlign w:val="center"/>
+          </w:tcPr>
+          <w:p>
+            <w:pPr>
+              <w:spacing w:after="0"/>
+            </w:pPr>
+            <w:r>
+              <w:rPr>
+                <w:rFonts w:ascii="Calibri" w:cs="Calibri" w:eastAsia="Calibri" w:hAnsi="Calibri"/>
+                <w:b w:val="false"/>
+                <w:bCs w:val="false"/>
+                <w:sz w:val="19"/>
+                <w:szCs w:val="19"/>
+              </w:rPr>
+              <w:t xml:space="preserve">Recette, formation par profil, mise en production</w:t>
+            </w:r>
+          </w:p>
+        </w:tc>
+        <w:tc>
+          <w:tcPr>
+            <w:tcW w:type="dxa" w:w="2200"/>
+            <w:tcBorders>
+              <w:top w:val="single" w:color="C9CFD8" w:sz="4"/>
+              <w:left w:val="single" w:color="C9CFD8" w:sz="4"/>
+              <w:bottom w:val="single" w:color="C9CFD8" w:sz="4"/>
+              <w:right w:val="single" w:color="C9CFD8" w:sz="4"/>
+            </w:tcBorders>
+            <w:shd w:fill="F2F4F7" w:color="auto" w:val="clear"/>
+            <w:tcMar>
+              <w:top w:type="dxa" w:w="60"/>
+              <w:left w:type="dxa" w:w="100"/>
+              <w:bottom w:type="dxa" w:w="60"/>
+              <w:right w:type="dxa" w:w="100"/>
+            </w:tcMar>
+            <w:vAlign w:val="center"/>
+          </w:tcPr>
+          <w:p>
+            <w:pPr>
+              <w:spacing w:after="0"/>
+            </w:pPr>
+            <w:r>
+              <w:rPr>
+                <w:rFonts w:ascii="Calibri" w:cs="Calibri" w:eastAsia="Calibri" w:hAnsi="Calibri"/>
+                <w:b w:val="false"/>
+                <w:bCs w:val="false"/>
+                <w:sz w:val="19"/>
+                <w:szCs w:val="19"/>
+              </w:rPr>
+              <w:t xml:space="preserve">1 500 000 GNF</w:t>
+            </w:r>
+          </w:p>
+        </w:tc>
+        <w:tc>
+          <w:tcPr>
+            <w:tcW w:type="dxa" w:w="1200"/>
+            <w:tcBorders>
+              <w:top w:val="single" w:color="C9CFD8" w:sz="4"/>
+              <w:left w:val="single" w:color="C9CFD8" w:sz="4"/>
+              <w:bottom w:val="single" w:color="C9CFD8" w:sz="4"/>
+              <w:right w:val="single" w:color="C9CFD8" w:sz="4"/>
+            </w:tcBorders>
+            <w:shd w:fill="F2F4F7" w:color="auto" w:val="clear"/>
+            <w:tcMar>
+              <w:top w:type="dxa" w:w="60"/>
+              <w:left w:type="dxa" w:w="100"/>
+              <w:bottom w:type="dxa" w:w="60"/>
+              <w:right w:type="dxa" w:w="100"/>
+            </w:tcMar>
+            <w:vAlign w:val="center"/>
+          </w:tcPr>
+          <w:p>
+            <w:pPr>
+              <w:spacing w:after="0"/>
+            </w:pPr>
+            <w:r>
+              <w:rPr>
+                <w:rFonts w:ascii="Calibri" w:cs="Calibri" w:eastAsia="Calibri" w:hAnsi="Calibri"/>
+                <w:b w:val="false"/>
+                <w:bCs w:val="false"/>
+                <w:sz w:val="19"/>
+                <w:szCs w:val="19"/>
+              </w:rPr>
+              <w:t xml:space="preserve">3 %</w:t>
+            </w:r>
+          </w:p>
+        </w:tc>
+      </w:tr>
+      <w:tr>
+        <w:tc>
+          <w:tcPr>
+            <w:tcW w:type="dxa" w:w="6238"/>
+            <w:tcBorders>
+              <w:top w:val="single" w:color="C9CFD8" w:sz="4"/>
+              <w:left w:val="single" w:color="C9CFD8" w:sz="4"/>
+              <w:bottom w:val="single" w:color="C9CFD8" w:sz="4"/>
+              <w:right w:val="single" w:color="C9CFD8" w:sz="4"/>
+            </w:tcBorders>
+            <w:tcMar>
+              <w:top w:type="dxa" w:w="60"/>
+              <w:left w:type="dxa" w:w="100"/>
+              <w:bottom w:type="dxa" w:w="60"/>
+              <w:right w:type="dxa" w:w="100"/>
+            </w:tcMar>
+            <w:vAlign w:val="center"/>
+          </w:tcPr>
+          <w:p>
+            <w:pPr>
+              <w:spacing w:after="0"/>
+            </w:pPr>
+            <w:r>
+              <w:rPr>
+                <w:rFonts w:ascii="Calibri" w:cs="Calibri" w:eastAsia="Calibri" w:hAnsi="Calibri"/>
+                <w:b w:val="false"/>
+                <w:bCs w:val="false"/>
+                <w:sz w:val="19"/>
+                <w:szCs w:val="19"/>
+              </w:rPr>
+              <w:t xml:space="preserve">Hébergement VPS et sauvegardes hors site pendant 12 mois</w:t>
+            </w:r>
+          </w:p>
+        </w:tc>
+        <w:tc>
+          <w:tcPr>
+            <w:tcW w:type="dxa" w:w="2200"/>
+            <w:tcBorders>
+              <w:top w:val="single" w:color="C9CFD8" w:sz="4"/>
+              <w:left w:val="single" w:color="C9CFD8" w:sz="4"/>
+              <w:bottom w:val="single" w:color="C9CFD8" w:sz="4"/>
+              <w:right w:val="single" w:color="C9CFD8" w:sz="4"/>
+            </w:tcBorders>
+            <w:tcMar>
+              <w:top w:type="dxa" w:w="60"/>
+              <w:left w:type="dxa" w:w="100"/>
+              <w:bottom w:type="dxa" w:w="60"/>
+              <w:right w:type="dxa" w:w="100"/>
+            </w:tcMar>
+            <w:vAlign w:val="center"/>
+          </w:tcPr>
+          <w:p>
+            <w:pPr>
+              <w:spacing w:after="0"/>
+            </w:pPr>
+            <w:r>
+              <w:rPr>
+                <w:rFonts w:ascii="Calibri" w:cs="Calibri" w:eastAsia="Calibri" w:hAnsi="Calibri"/>
+                <w:b w:val="false"/>
+                <w:bCs w:val="false"/>
+                <w:sz w:val="19"/>
+                <w:szCs w:val="19"/>
+              </w:rPr>
+              <w:t xml:space="preserve">1 000 000 GNF</w:t>
+            </w:r>
+          </w:p>
+        </w:tc>
+        <w:tc>
+          <w:tcPr>
+            <w:tcW w:type="dxa" w:w="1200"/>
+            <w:tcBorders>
+              <w:top w:val="single" w:color="C9CFD8" w:sz="4"/>
+              <w:left w:val="single" w:color="C9CFD8" w:sz="4"/>
+              <w:bottom w:val="single" w:color="C9CFD8" w:sz="4"/>
+              <w:right w:val="single" w:color="C9CFD8" w:sz="4"/>
+            </w:tcBorders>
+            <w:tcMar>
+              <w:top w:type="dxa" w:w="60"/>
+              <w:left w:type="dxa" w:w="100"/>
+              <w:bottom w:type="dxa" w:w="60"/>
+              <w:right w:type="dxa" w:w="100"/>
+            </w:tcMar>
+            <w:vAlign w:val="center"/>
+          </w:tcPr>
+          <w:p>
+            <w:pPr>
+              <w:spacing w:after="0"/>
+            </w:pPr>
+            <w:r>
+              <w:rPr>
+                <w:rFonts w:ascii="Calibri" w:cs="Calibri" w:eastAsia="Calibri" w:hAnsi="Calibri"/>
+                <w:b w:val="false"/>
+                <w:bCs w:val="false"/>
+                <w:sz w:val="19"/>
+                <w:szCs w:val="19"/>
+              </w:rPr>
+              <w:t xml:space="preserve">2 %</w:t>
             </w:r>
           </w:p>
         </w:tc>

</xml_diff>